<commit_message>
Configuración de fechas en modelos y elección de mes y año en interfaces de fase inicial y final
</commit_message>
<xml_diff>
--- a/Modelos_documentos/CONFORMIDAD CONTRATO - MODELO.docx
+++ b/Modelos_documentos/CONFORMIDAD CONTRATO - MODELO.docx
@@ -326,7 +326,27 @@
           <w:sz w:val="24"/>
           <w:szCs w:val="24"/>
         </w:rPr>
-        <w:t xml:space="preserve"> _____ /UNMSM -FLCH/2025 por el importe de </w:t>
+        <w:t xml:space="preserve"> </w:t>
+      </w:r>
+      <w:proofErr w:type="spellStart"/>
+      <w:r>
+        <w:rPr>
+          <w:rFonts w:ascii="Garamond" w:hAnsi="Garamond" w:cs="Arial"/>
+          <w:spacing w:val="1"/>
+          <w:sz w:val="24"/>
+          <w:szCs w:val="24"/>
+        </w:rPr>
+        <w:t>Nro_Contrato</w:t>
+      </w:r>
+      <w:proofErr w:type="spellEnd"/>
+      <w:r>
+        <w:rPr>
+          <w:rFonts w:ascii="Garamond" w:hAnsi="Garamond" w:cs="Arial"/>
+          <w:spacing w:val="1"/>
+          <w:sz w:val="24"/>
+          <w:szCs w:val="24"/>
+        </w:rPr>
+        <w:t xml:space="preserve">/UNMSM -FLCH/2025 por el importe de </w:t>
       </w:r>
       <w:proofErr w:type="spellStart"/>
       <w:r>

</xml_diff>

<commit_message>
Inserción de idiomas por docente y modificación de planillas word.
</commit_message>
<xml_diff>
--- a/Modelos_documentos/CONFORMIDAD CONTRATO - MODELO.docx
+++ b/Modelos_documentos/CONFORMIDAD CONTRATO - MODELO.docx
@@ -190,7 +190,7 @@
           <w:sz w:val="24"/>
           <w:szCs w:val="24"/>
         </w:rPr>
-        <w:t>6 de junio de 2025</w:t>
+        <w:t>19 de junio de 2025</w:t>
       </w:r>
       <w:r>
         <w:rPr>
@@ -288,9 +288,8 @@
           <w:sz w:val="24"/>
           <w:szCs w:val="24"/>
         </w:rPr>
-        <w:t xml:space="preserve">, ha realizado satisfactoriamente el </w:t>
-      </w:r>
-      <w:proofErr w:type="spellStart"/>
+        <w:t xml:space="preserve">, ha realizado satisfactoriamente el descripcion_cursos en el Centro de Idiomas de la FLCH, bajo la modalidad híbrida, según orden de servicio N.º ________, y en cumplimiento de la </w:t>
+      </w:r>
       <w:r>
         <w:rPr>
           <w:rFonts w:ascii="Garamond" w:hAnsi="Garamond" w:cs="Arial"/>
@@ -298,9 +297,8 @@
           <w:sz w:val="24"/>
           <w:szCs w:val="24"/>
         </w:rPr>
-        <w:t>descripcion_cursos</w:t>
-      </w:r>
-      <w:proofErr w:type="spellEnd"/>
+        <w:t>segunda</w:t>
+      </w:r>
       <w:r>
         <w:rPr>
           <w:rFonts w:ascii="Garamond" w:hAnsi="Garamond" w:cs="Arial"/>
@@ -308,7 +306,7 @@
           <w:sz w:val="24"/>
           <w:szCs w:val="24"/>
         </w:rPr>
-        <w:t xml:space="preserve"> en el Centro de Idiomas de la FLCH, bajo la modalidad híbrida, según orden de servicio N.º ________, y en cumplimiento de la primera armada del contrato de locación de servicios </w:t>
+        <w:t xml:space="preserve"> armada del contrato de locación de servicios </w:t>
       </w:r>
       <w:r>
         <w:rPr>
@@ -328,7 +326,6 @@
         </w:rPr>
         <w:t xml:space="preserve"> </w:t>
       </w:r>
-      <w:proofErr w:type="spellStart"/>
       <w:r>
         <w:rPr>
           <w:rFonts w:ascii="Garamond" w:hAnsi="Garamond" w:cs="Arial"/>
@@ -338,7 +335,6 @@
         </w:rPr>
         <w:t>Nro_Contrato</w:t>
       </w:r>
-      <w:proofErr w:type="spellEnd"/>
       <w:r>
         <w:rPr>
           <w:rFonts w:ascii="Garamond" w:hAnsi="Garamond" w:cs="Arial"/>
@@ -346,47 +342,7 @@
           <w:sz w:val="24"/>
           <w:szCs w:val="24"/>
         </w:rPr>
-        <w:t xml:space="preserve">/UNMSM -FLCH/2025 por el importe de </w:t>
-      </w:r>
-      <w:proofErr w:type="spellStart"/>
-      <w:r>
-        <w:rPr>
-          <w:rFonts w:ascii="Garamond" w:hAnsi="Garamond" w:cs="Arial"/>
-          <w:spacing w:val="1"/>
-          <w:sz w:val="24"/>
-          <w:szCs w:val="24"/>
-        </w:rPr>
-        <w:t>monto_subtotal</w:t>
-      </w:r>
-      <w:proofErr w:type="spellEnd"/>
-      <w:r>
-        <w:rPr>
-          <w:rFonts w:ascii="Garamond" w:hAnsi="Garamond" w:cs="Arial"/>
-          <w:spacing w:val="1"/>
-          <w:sz w:val="24"/>
-          <w:szCs w:val="24"/>
-        </w:rPr>
-        <w:t xml:space="preserve">, monto por hora: </w:t>
-      </w:r>
-      <w:proofErr w:type="spellStart"/>
-      <w:r>
-        <w:rPr>
-          <w:rFonts w:ascii="Garamond" w:hAnsi="Garamond" w:cs="Arial"/>
-          <w:spacing w:val="1"/>
-          <w:sz w:val="24"/>
-          <w:szCs w:val="24"/>
-        </w:rPr>
-        <w:t>monto_hora</w:t>
-      </w:r>
-      <w:proofErr w:type="spellEnd"/>
-      <w:r>
-        <w:rPr>
-          <w:rFonts w:ascii="Garamond" w:hAnsi="Garamond" w:cs="Arial"/>
-          <w:spacing w:val="1"/>
-          <w:sz w:val="24"/>
-          <w:szCs w:val="24"/>
-        </w:rPr>
-        <w:t>.</w:t>
+        <w:t>/UNMSM -FLCH/2025 por el importe de monto_subtotal, monto por hora: monto_hora.</w:t>
       </w:r>
     </w:p>
     <w:p>
@@ -558,7 +514,25 @@
           <w:sz w:val="24"/>
           <w:szCs w:val="24"/>
         </w:rPr>
-        <w:t xml:space="preserve">Director de Dirección de Gestión Institucional </w:t>
+        <w:t xml:space="preserve">Director de </w:t>
+      </w:r>
+      <w:r>
+        <w:rPr>
+          <w:rFonts w:ascii="Garamond" w:hAnsi="Garamond" w:cs="Arial"/>
+          <w:b/>
+          <w:sz w:val="24"/>
+          <w:szCs w:val="24"/>
+        </w:rPr>
+        <w:t xml:space="preserve">la </w:t>
+      </w:r>
+      <w:r>
+        <w:rPr>
+          <w:rFonts w:ascii="Garamond" w:hAnsi="Garamond" w:cs="Arial"/>
+          <w:b/>
+          <w:sz w:val="24"/>
+          <w:szCs w:val="24"/>
+        </w:rPr>
+        <w:t xml:space="preserve">Dirección de Gestión Institucional </w:t>
       </w:r>
     </w:p>
     <w:p>

</xml_diff>

<commit_message>
Correcciones en plantillas modelos e interfaces
</commit_message>
<xml_diff>
--- a/Modelos_documentos/CONFORMIDAD CONTRATO - MODELO.docx
+++ b/Modelos_documentos/CONFORMIDAD CONTRATO - MODELO.docx
@@ -190,7 +190,7 @@
           <w:sz w:val="24"/>
           <w:szCs w:val="24"/>
         </w:rPr>
-        <w:t>19 de junio de 2025</w:t>
+        <w:t>18 de julio de 2025</w:t>
       </w:r>
       <w:r>
         <w:rPr>
@@ -288,16 +288,36 @@
           <w:sz w:val="24"/>
           <w:szCs w:val="24"/>
         </w:rPr>
-        <w:t xml:space="preserve">, ha realizado satisfactoriamente el descripcion_cursos en el Centro de Idiomas de la FLCH, bajo la modalidad híbrida, según orden de servicio N.º ________, y en cumplimiento de la </w:t>
-      </w:r>
-      <w:r>
-        <w:rPr>
-          <w:rFonts w:ascii="Garamond" w:hAnsi="Garamond" w:cs="Arial"/>
-          <w:spacing w:val="1"/>
-          <w:sz w:val="24"/>
-          <w:szCs w:val="24"/>
-        </w:rPr>
-        <w:t>segunda</w:t>
+        <w:t xml:space="preserve">, ha realizado satisfactoriamente el </w:t>
+      </w:r>
+      <w:proofErr w:type="spellStart"/>
+      <w:r>
+        <w:rPr>
+          <w:rFonts w:ascii="Garamond" w:hAnsi="Garamond" w:cs="Arial"/>
+          <w:spacing w:val="1"/>
+          <w:sz w:val="24"/>
+          <w:szCs w:val="24"/>
+        </w:rPr>
+        <w:t>descripcion_cursos</w:t>
+      </w:r>
+      <w:proofErr w:type="spellEnd"/>
+      <w:r>
+        <w:rPr>
+          <w:rFonts w:ascii="Garamond" w:hAnsi="Garamond" w:cs="Arial"/>
+          <w:spacing w:val="1"/>
+          <w:sz w:val="24"/>
+          <w:szCs w:val="24"/>
+        </w:rPr>
+        <w:t xml:space="preserve"> en el Centro de Idiomas de la FLCH, bajo la modalidad híbrida, según orden de servicio N.º ________, y en cumplimiento de la </w:t>
+      </w:r>
+      <w:r>
+        <w:rPr>
+          <w:rFonts w:ascii="Garamond" w:hAnsi="Garamond" w:cs="Arial"/>
+          <w:spacing w:val="1"/>
+          <w:sz w:val="24"/>
+          <w:szCs w:val="24"/>
+        </w:rPr>
+        <w:t>numero_armada</w:t>
       </w:r>
       <w:r>
         <w:rPr>
@@ -326,6 +346,7 @@
         </w:rPr>
         <w:t xml:space="preserve"> </w:t>
       </w:r>
+      <w:proofErr w:type="spellStart"/>
       <w:r>
         <w:rPr>
           <w:rFonts w:ascii="Garamond" w:hAnsi="Garamond" w:cs="Arial"/>
@@ -335,14 +356,55 @@
         </w:rPr>
         <w:t>Nro_Contrato</w:t>
       </w:r>
-      <w:r>
-        <w:rPr>
-          <w:rFonts w:ascii="Garamond" w:hAnsi="Garamond" w:cs="Arial"/>
-          <w:spacing w:val="1"/>
-          <w:sz w:val="24"/>
-          <w:szCs w:val="24"/>
-        </w:rPr>
-        <w:t>/UNMSM -FLCH/2025 por el importe de monto_subtotal, monto por hora: monto_hora.</w:t>
+      <w:proofErr w:type="spellEnd"/>
+      <w:r>
+        <w:rPr>
+          <w:rFonts w:ascii="Garamond" w:hAnsi="Garamond" w:cs="Arial"/>
+          <w:spacing w:val="1"/>
+          <w:sz w:val="24"/>
+          <w:szCs w:val="24"/>
+        </w:rPr>
+        <w:t xml:space="preserve">/UNMSM -FLCH/2025 por el importe de </w:t>
+      </w:r>
+      <w:proofErr w:type="spellStart"/>
+      <w:r>
+        <w:rPr>
+          <w:rFonts w:ascii="Garamond" w:hAnsi="Garamond" w:cs="Arial"/>
+          <w:spacing w:val="1"/>
+          <w:sz w:val="24"/>
+          <w:szCs w:val="24"/>
+        </w:rPr>
+        <w:t>monto_subtotal</w:t>
+      </w:r>
+      <w:proofErr w:type="spellEnd"/>
+      <w:r>
+        <w:rPr>
+          <w:rFonts w:ascii="Garamond" w:hAnsi="Garamond" w:cs="Arial"/>
+          <w:spacing w:val="1"/>
+          <w:sz w:val="24"/>
+          <w:szCs w:val="24"/>
+        </w:rPr>
+        <w:t xml:space="preserve">, monto por hora: </w:t>
+      </w:r>
+      <w:proofErr w:type="spellStart"/>
+      <w:r>
+        <w:rPr>
+          <w:rFonts w:ascii="Garamond" w:hAnsi="Garamond" w:cs="Arial"/>
+          <w:spacing w:val="1"/>
+          <w:sz w:val="24"/>
+          <w:szCs w:val="24"/>
+        </w:rPr>
+        <w:t>monto_hora</w:t>
+      </w:r>
+      <w:proofErr w:type="spellEnd"/>
+      <w:r>
+        <w:rPr>
+          <w:rFonts w:ascii="Garamond" w:hAnsi="Garamond" w:cs="Arial"/>
+          <w:spacing w:val="1"/>
+          <w:sz w:val="24"/>
+          <w:szCs w:val="24"/>
+        </w:rPr>
+        <w:t>.</w:t>
       </w:r>
     </w:p>
     <w:p>

</xml_diff>